<commit_message>
update plan for game design
</commit_message>
<xml_diff>
--- a/Design/Roam_Alone_Game_Design_Document.docx
+++ b/Design/Roam_Alone_Game_Design_Document.docx
@@ -20,7 +20,7 @@
     </w:p>
     <w:p>
       <w:r>
-        <w:t>Working title  •  Version 0.2  •  27 October 2026</w:t>
+        <w:t>Working title  •  Version 0.3  •  27 October 2026</w:t>
       </w:r>
     </w:p>
     <w:p>
@@ -73,7 +73,7 @@
     </w:p>
     <w:p>
       <w:r>
-        <w:t>The referenced chat was consulted. Its accessible history contains setup discussion and unresolved content references rather than the earlier design details. The current request is therefore the authority for the design baseline. The project files and installed tool versions were not audited for this document.</w:t>
+        <w:t>This revision records the current campsite encounter direction. CONFIRMED describes the requested experience; PROPOSED describes a prototype approach or candidate cue. Design entries do not by themselves claim that gameplay, assets or packaged validation are complete.</w:t>
       </w:r>
     </w:p>
     <w:p>
@@ -260,7 +260,7 @@
               <w:rPr>
                 <w:sz w:val="19"/>
               </w:rPr>
-              <w:t>4–6</w:t>
+              <w:t>4–7</w:t>
             </w:r>
           </w:p>
         </w:tc>
@@ -290,7 +290,7 @@
               <w:rPr>
                 <w:sz w:val="19"/>
               </w:rPr>
-              <w:t>Systems, horror pacing, narrative and campsite design</w:t>
+              <w:t>Systems, first night, routines, cues and campsite design</w:t>
             </w:r>
           </w:p>
         </w:tc>
@@ -325,7 +325,7 @@
               <w:rPr>
                 <w:sz w:val="19"/>
               </w:rPr>
-              <w:t>7–9</w:t>
+              <w:t>8–11</w:t>
             </w:r>
           </w:p>
         </w:tc>
@@ -355,7 +355,7 @@
               <w:rPr>
                 <w:sz w:val="19"/>
               </w:rPr>
-              <w:t>Art and audio, accessibility and technical architecture</w:t>
+              <w:t>Art, audio, accessibility and encounter authoring</w:t>
             </w:r>
           </w:p>
         </w:tc>
@@ -390,7 +390,7 @@
               <w:rPr>
                 <w:sz w:val="19"/>
               </w:rPr>
-              <w:t>10–12</w:t>
+              <w:t>12–14</w:t>
             </w:r>
           </w:p>
         </w:tc>
@@ -433,7 +433,7 @@
     </w:p>
     <w:p>
       <w:r>
-        <w:t>Recommended next action: graybox the exterior route, van threshold and interior, then prove movement and door locking before producing polished assets.</w:t>
+        <w:t>Next prototype: one ordinary outdoor task, a readable reason to retreat, and a nighttime disturbance whose response uses the actual van door state. Prove this small sequence before adding more chores or scares.</w:t>
       </w:r>
     </w:p>
     <w:p>
@@ -1104,7 +1104,7 @@
               <w:rPr>
                 <w:sz w:val="19"/>
               </w:rPr>
-              <w:t>One water or bathroom task; no survival meters</w:t>
+              <w:t>One ordinary outdoor task; water or bathroom outings deferred</w:t>
             </w:r>
           </w:p>
         </w:tc>
@@ -1256,7 +1256,7 @@
     </w:p>
     <w:p>
       <w:r>
-        <w:t>PROPOSED playable loop — Explore → learn the route and exits → complete a modest routine → close and manually lock doors → notice a disturbance → choose how to investigate or wait → face an unavoidable outdoor task → return and reassess safety → reach the morning resolution.</w:t>
+        <w:t>CONFIRMED encounter direction — Perform an ordinary campsite task outdoors during day or evening → notice increasingly unsettling cues → receive a reason to retreat → enter the van at night → choose whether to close and lock up → experience a disturbance that responds to the actual door state → reach a clear resolution.</w:t>
       </w:r>
     </w:p>
     <w:p>
@@ -1654,7 +1654,7 @@
               <w:rPr>
                 <w:sz w:val="19"/>
               </w:rPr>
-              <w:t>R near a door lock</w:t>
+              <w:t>E when aiming at the inside lock</w:t>
             </w:r>
           </w:p>
         </w:tc>
@@ -1684,7 +1684,7 @@
               <w:rPr>
                 <w:sz w:val="19"/>
               </w:rPr>
-              <w:t>Explicit separate action with a visible state response</w:t>
+              <w:t>Separate contextual lock target; use the same interaction action</w:t>
             </w:r>
           </w:p>
         </w:tc>
@@ -2026,7 +2026,7 @@
     </w:p>
     <w:p>
       <w:r>
-        <w:t>CONFIRMED — Doors can be locked manually. PROPOSED model — Track open or closed and locked or unlocked as independent state, with locking valid only when fully closed. An open door must first close before locking. Repeated inputs cannot reverse an animation into an invalid state.</w:t>
+        <w:t>CONFIRMED — Doors can be locked manually only while closed. Closing does not automatically lock. A locked door refuses opening; an inside unlock action remains available without a key or resource. The encounter must observe the existing door owner and preserve these rules.</w:t>
       </w:r>
     </w:p>
     <w:p>
@@ -2044,7 +2044,7 @@
     </w:p>
     <w:p>
       <w:r>
-        <w:t>CONFIRMED — Bathroom or water needs occasionally create risk outside. PROPOSED — Implement one authored task, triggered after an initial disturbance. A simple objective explains the destination; completion changes a task flag. Avoid continuous thirst, bodily urgency timers, resource crafting and repeated chores.</w:t>
+        <w:t>CONFIRMED direction — Ordinary outdoor activities establish routine before the night encounter. PROPOSED first task — Collect one firewood bundle and place it at the fire. Fire preparation and cooking are candidate later interactions. A water or bathroom outing can be considered later; it is no longer the required trigger for the first prototype. Avoid survival meters, broad inventories and crafting systems.</w:t>
       </w:r>
     </w:p>
     <w:p>
@@ -2234,7 +2234,7 @@
               <w:rPr>
                 <w:sz w:val="19"/>
               </w:rPr>
-              <w:t>Place and trigger footsteps, knocks and a vehicle cue</w:t>
+              <w:t>Bounded ambient cues plus explicit critical footsteps and knocks</w:t>
             </w:r>
           </w:p>
         </w:tc>
@@ -2329,7 +2329,7 @@
               <w:rPr>
                 <w:sz w:val="19"/>
               </w:rPr>
-              <w:t>Advance on prerequisite flags and completed beats</w:t>
+              <w:t>One placed director; prerequisites, phase and one-shot flags</w:t>
             </w:r>
           </w:p>
         </w:tc>
@@ -2614,7 +2614,7 @@
               <w:rPr>
                 <w:sz w:val="19"/>
               </w:rPr>
-              <w:t>Restore one safe state and event flags</w:t>
+              <w:t>Deterministic development reset first; checkpoint remains proposed</w:t>
             </w:r>
           </w:p>
         </w:tc>
@@ -2665,7 +2665,7 @@
     </w:p>
     <w:p>
       <w:r>
-        <w:t>OPEN — Whether the game includes death, capture, a chase or only narrative consequences. PROPOSED prototype default — An unlocked-door mistake causes a brief encounter and checkpoint restart, without combat or a full chase. If this distracts from the core event, begin with a nonlethal escalation and evaluate failure later.</w:t>
+        <w:t>OPEN — The exact unlocked-door consequence and recovery. A brief door opening with an alarming cue and an opportunity to respond is PROPOSED for evaluation. Death, capture, chase, forced intrusion and checkpoint restart are not approved by this revision. Define a readable consequence before implementing it; a locked door must not be silently bypassed.</w:t>
       </w:r>
     </w:p>
     <w:p>
@@ -2693,7 +2693,7 @@
     </w:p>
     <w:p>
       <w:r>
-        <w:t>PROPOSED sequence — The following is an implementable test scene, not established story canon. Use authored triggers and delays to make the event repeatable during development. Timing ranges are tuning suggestions, not a committed episode length.</w:t>
+        <w:t>CONFIRMED direction — Daytime or evening routine builds unease before a nighttime retreat into the van. The sequence below is a PROPOSED first playable slice. Use explicit prerequisites and one-shot events; individual sounds, figure placement, delays and the resolution remain tuning choices.</w:t>
       </w:r>
     </w:p>
     <w:tbl>
@@ -2840,7 +2840,7 @@
               <w:rPr>
                 <w:sz w:val="19"/>
               </w:rPr>
-              <w:t>Daylight arrival</w:t>
+              <w:t>Daylight routine</w:t>
             </w:r>
           </w:p>
         </w:tc>
@@ -2870,7 +2870,7 @@
               <w:rPr>
                 <w:sz w:val="19"/>
               </w:rPr>
-              <w:t>A scenic clearing feels inviting</w:t>
+              <w:t>Learn the campsite while doing a normal task</w:t>
             </w:r>
           </w:p>
         </w:tc>
@@ -2900,102 +2900,7 @@
               <w:rPr>
                 <w:sz w:val="19"/>
               </w:rPr>
-              <w:t>Player learns the van, water point and short return route</w:t>
-            </w:r>
-          </w:p>
-        </w:tc>
-      </w:tr>
-      <w:tr>
-        <w:trPr>
-          <w:cantSplit/>
-        </w:trPr>
-        <w:tc>
-          <w:tcPr>
-            <w:tcW w:type="dxa" w:w="1512"/>
-            <w:vAlign w:val="center"/>
-            <w:shd w:fill="FFFFFF"/>
-            <w:tcBorders>
-              <w:top w:val="single" w:sz="4" w:color="D9D9D9"/>
-              <w:left w:val="single" w:sz="4" w:color="D9D9D9"/>
-              <w:bottom w:val="single" w:sz="4" w:color="D9D9D9"/>
-              <w:right w:val="single" w:sz="4" w:color="D9D9D9"/>
-            </w:tcBorders>
-            <w:tcMar>
-              <w:top w:w="95" w:type="dxa"/>
-              <w:left w:w="95" w:type="dxa"/>
-              <w:bottom w:w="95" w:type="dxa"/>
-              <w:right w:w="95" w:type="dxa"/>
-            </w:tcMar>
-          </w:tcPr>
-          <w:p>
-            <w:pPr>
-              <w:spacing w:after="40" w:line="247" w:lineRule="auto"/>
-            </w:pPr>
-            <w:r>
-              <w:rPr>
-                <w:sz w:val="19"/>
-              </w:rPr>
-              <w:t>Preparation</w:t>
-            </w:r>
-          </w:p>
-        </w:tc>
-        <w:tc>
-          <w:tcPr>
-            <w:tcW w:type="dxa" w:w="3384"/>
-            <w:vAlign w:val="center"/>
-            <w:shd w:fill="FFFFFF"/>
-            <w:tcBorders>
-              <w:top w:val="single" w:sz="4" w:color="D9D9D9"/>
-              <w:left w:val="single" w:sz="4" w:color="D9D9D9"/>
-              <w:bottom w:val="single" w:sz="4" w:color="D9D9D9"/>
-              <w:right w:val="single" w:sz="4" w:color="D9D9D9"/>
-            </w:tcBorders>
-            <w:tcMar>
-              <w:top w:w="95" w:type="dxa"/>
-              <w:left w:w="95" w:type="dxa"/>
-              <w:bottom w:w="95" w:type="dxa"/>
-              <w:right w:w="95" w:type="dxa"/>
-            </w:tcMar>
-          </w:tcPr>
-          <w:p>
-            <w:pPr>
-              <w:spacing w:after="40" w:line="247" w:lineRule="auto"/>
-            </w:pPr>
-            <w:r>
-              <w:rPr>
-                <w:sz w:val="19"/>
-              </w:rPr>
-              <w:t>The camper becomes familiar</w:t>
-            </w:r>
-          </w:p>
-        </w:tc>
-        <w:tc>
-          <w:tcPr>
-            <w:tcW w:type="dxa" w:w="5040"/>
-            <w:vAlign w:val="center"/>
-            <w:shd w:fill="FFFFFF"/>
-            <w:tcBorders>
-              <w:top w:val="single" w:sz="4" w:color="D9D9D9"/>
-              <w:left w:val="single" w:sz="4" w:color="D9D9D9"/>
-              <w:bottom w:val="single" w:sz="4" w:color="D9D9D9"/>
-              <w:right w:val="single" w:sz="4" w:color="D9D9D9"/>
-            </w:tcBorders>
-            <w:tcMar>
-              <w:top w:w="95" w:type="dxa"/>
-              <w:left w:w="95" w:type="dxa"/>
-              <w:bottom w:w="95" w:type="dxa"/>
-              <w:right w:w="95" w:type="dxa"/>
-            </w:tcMar>
-          </w:tcPr>
-          <w:p>
-            <w:pPr>
-              <w:spacing w:after="40" w:line="247" w:lineRule="auto"/>
-            </w:pPr>
-            <w:r>
-              <w:rPr>
-                <w:sz w:val="19"/>
-              </w:rPr>
-              <w:t>Player practices closing and locking the main door</w:t>
+              <w:t>Proposed: collect a firewood bundle and place it at the fire</w:t>
             </w:r>
           </w:p>
         </w:tc>
@@ -3030,7 +2935,7 @@
               <w:rPr>
                 <w:sz w:val="19"/>
               </w:rPr>
-              <w:t>First anomaly</w:t>
+              <w:t>Outdoor unease</w:t>
             </w:r>
           </w:p>
         </w:tc>
@@ -3060,7 +2965,7 @@
               <w:rPr>
                 <w:sz w:val="19"/>
               </w:rPr>
-              <w:t>Footsteps stop close to the van</w:t>
+              <w:t>A small sound interrupts concentration</w:t>
             </w:r>
           </w:p>
         </w:tc>
@@ -3090,102 +2995,7 @@
               <w:rPr>
                 <w:sz w:val="19"/>
               </w:rPr>
-              <w:t>Begin after interior entry; play one spatial sound sequence</w:t>
-            </w:r>
-          </w:p>
-        </w:tc>
-      </w:tr>
-      <w:tr>
-        <w:trPr>
-          <w:cantSplit/>
-        </w:trPr>
-        <w:tc>
-          <w:tcPr>
-            <w:tcW w:type="dxa" w:w="1512"/>
-            <w:vAlign w:val="center"/>
-            <w:shd w:fill="FFFFFF"/>
-            <w:tcBorders>
-              <w:top w:val="single" w:sz="4" w:color="D9D9D9"/>
-              <w:left w:val="single" w:sz="4" w:color="D9D9D9"/>
-              <w:bottom w:val="single" w:sz="4" w:color="D9D9D9"/>
-              <w:right w:val="single" w:sz="4" w:color="D9D9D9"/>
-            </w:tcBorders>
-            <w:tcMar>
-              <w:top w:w="95" w:type="dxa"/>
-              <w:left w:w="95" w:type="dxa"/>
-              <w:bottom w:w="95" w:type="dxa"/>
-              <w:right w:w="95" w:type="dxa"/>
-            </w:tcMar>
-          </w:tcPr>
-          <w:p>
-            <w:pPr>
-              <w:spacing w:after="40" w:line="247" w:lineRule="auto"/>
-            </w:pPr>
-            <w:r>
-              <w:rPr>
-                <w:sz w:val="19"/>
-              </w:rPr>
-              <w:t>Silence</w:t>
-            </w:r>
-          </w:p>
-        </w:tc>
-        <w:tc>
-          <w:tcPr>
-            <w:tcW w:type="dxa" w:w="3384"/>
-            <w:vAlign w:val="center"/>
-            <w:shd w:fill="FFFFFF"/>
-            <w:tcBorders>
-              <w:top w:val="single" w:sz="4" w:color="D9D9D9"/>
-              <w:left w:val="single" w:sz="4" w:color="D9D9D9"/>
-              <w:bottom w:val="single" w:sz="4" w:color="D9D9D9"/>
-              <w:right w:val="single" w:sz="4" w:color="D9D9D9"/>
-            </w:tcBorders>
-            <w:tcMar>
-              <w:top w:w="95" w:type="dxa"/>
-              <w:left w:w="95" w:type="dxa"/>
-              <w:bottom w:w="95" w:type="dxa"/>
-              <w:right w:w="95" w:type="dxa"/>
-            </w:tcMar>
-          </w:tcPr>
-          <w:p>
-            <w:pPr>
-              <w:spacing w:after="40" w:line="247" w:lineRule="auto"/>
-            </w:pPr>
-            <w:r>
-              <w:rPr>
-                <w:sz w:val="19"/>
-              </w:rPr>
-              <w:t>The player waits and checks the boundary</w:t>
-            </w:r>
-          </w:p>
-        </w:tc>
-        <w:tc>
-          <w:tcPr>
-            <w:tcW w:type="dxa" w:w="5040"/>
-            <w:vAlign w:val="center"/>
-            <w:shd w:fill="FFFFFF"/>
-            <w:tcBorders>
-              <w:top w:val="single" w:sz="4" w:color="D9D9D9"/>
-              <w:left w:val="single" w:sz="4" w:color="D9D9D9"/>
-              <w:bottom w:val="single" w:sz="4" w:color="D9D9D9"/>
-              <w:right w:val="single" w:sz="4" w:color="D9D9D9"/>
-            </w:tcBorders>
-            <w:tcMar>
-              <w:top w:w="95" w:type="dxa"/>
-              <w:left w:w="95" w:type="dxa"/>
-              <w:bottom w:w="95" w:type="dxa"/>
-              <w:right w:w="95" w:type="dxa"/>
-            </w:tcMar>
-          </w:tcPr>
-          <w:p>
-            <w:pPr>
-              <w:spacing w:after="40" w:line="247" w:lineRule="auto"/>
-            </w:pPr>
-            <w:r>
-              <w:rPr>
-                <w:sz w:val="19"/>
-              </w:rPr>
-              <w:t>Leave a quiet window; avoid immediately stacking a sting</w:t>
+              <w:t>One authored branch snap after task progress; leave a quiet interval</w:t>
             </w:r>
           </w:p>
         </w:tc>
@@ -3220,7 +3030,7 @@
               <w:rPr>
                 <w:sz w:val="19"/>
               </w:rPr>
-              <w:t>Required outing</w:t>
+              <w:t>Possible presence</w:t>
             </w:r>
           </w:p>
         </w:tc>
@@ -3250,7 +3060,7 @@
               <w:rPr>
                 <w:sz w:val="19"/>
               </w:rPr>
-              <w:t>Water must be collected outside</w:t>
+              <w:t>A distant figure creates uncertainty</w:t>
             </w:r>
           </w:p>
         </w:tc>
@@ -3280,102 +3090,7 @@
               <w:rPr>
                 <w:sz w:val="19"/>
               </w:rPr>
-              <w:t>Enable the water objective after the first disturbance</w:t>
-            </w:r>
-          </w:p>
-        </w:tc>
-      </w:tr>
-      <w:tr>
-        <w:trPr>
-          <w:cantSplit/>
-        </w:trPr>
-        <w:tc>
-          <w:tcPr>
-            <w:tcW w:type="dxa" w:w="1512"/>
-            <w:vAlign w:val="center"/>
-            <w:shd w:fill="FFFFFF"/>
-            <w:tcBorders>
-              <w:top w:val="single" w:sz="4" w:color="D9D9D9"/>
-              <w:left w:val="single" w:sz="4" w:color="D9D9D9"/>
-              <w:bottom w:val="single" w:sz="4" w:color="D9D9D9"/>
-              <w:right w:val="single" w:sz="4" w:color="D9D9D9"/>
-            </w:tcBorders>
-            <w:tcMar>
-              <w:top w:w="95" w:type="dxa"/>
-              <w:left w:w="95" w:type="dxa"/>
-              <w:bottom w:w="95" w:type="dxa"/>
-              <w:right w:w="95" w:type="dxa"/>
-            </w:tcMar>
-          </w:tcPr>
-          <w:p>
-            <w:pPr>
-              <w:spacing w:after="40" w:line="247" w:lineRule="auto"/>
-            </w:pPr>
-            <w:r>
-              <w:rPr>
-                <w:sz w:val="19"/>
-              </w:rPr>
-              <w:t>Exposure</w:t>
-            </w:r>
-          </w:p>
-        </w:tc>
-        <w:tc>
-          <w:tcPr>
-            <w:tcW w:type="dxa" w:w="3384"/>
-            <w:vAlign w:val="center"/>
-            <w:shd w:fill="FFFFFF"/>
-            <w:tcBorders>
-              <w:top w:val="single" w:sz="4" w:color="D9D9D9"/>
-              <w:left w:val="single" w:sz="4" w:color="D9D9D9"/>
-              <w:bottom w:val="single" w:sz="4" w:color="D9D9D9"/>
-              <w:right w:val="single" w:sz="4" w:color="D9D9D9"/>
-            </w:tcBorders>
-            <w:tcMar>
-              <w:top w:w="95" w:type="dxa"/>
-              <w:left w:w="95" w:type="dxa"/>
-              <w:bottom w:w="95" w:type="dxa"/>
-              <w:right w:w="95" w:type="dxa"/>
-            </w:tcMar>
-          </w:tcPr>
-          <w:p>
-            <w:pPr>
-              <w:spacing w:after="40" w:line="247" w:lineRule="auto"/>
-            </w:pPr>
-            <w:r>
-              <w:rPr>
-                <w:sz w:val="19"/>
-              </w:rPr>
-              <w:t>A distant vehicle light crosses the trees</w:t>
-            </w:r>
-          </w:p>
-        </w:tc>
-        <w:tc>
-          <w:tcPr>
-            <w:tcW w:type="dxa" w:w="5040"/>
-            <w:vAlign w:val="center"/>
-            <w:shd w:fill="FFFFFF"/>
-            <w:tcBorders>
-              <w:top w:val="single" w:sz="4" w:color="D9D9D9"/>
-              <w:left w:val="single" w:sz="4" w:color="D9D9D9"/>
-              <w:bottom w:val="single" w:sz="4" w:color="D9D9D9"/>
-              <w:right w:val="single" w:sz="4" w:color="D9D9D9"/>
-            </w:tcBorders>
-            <w:tcMar>
-              <w:top w:w="95" w:type="dxa"/>
-              <w:left w:w="95" w:type="dxa"/>
-              <w:bottom w:w="95" w:type="dxa"/>
-              <w:right w:w="95" w:type="dxa"/>
-            </w:tcMar>
-          </w:tcPr>
-          <w:p>
-            <w:pPr>
-              <w:spacing w:after="40" w:line="247" w:lineRule="auto"/>
-            </w:pPr>
-            <w:r>
-              <w:rPr>
-                <w:sz w:val="19"/>
-              </w:rPr>
-              <w:t>Trigger once on the route; keep the return path legible</w:t>
+              <w:t>Optional later cue; remove after a verified look-away, never pop into a watched empty space</w:t>
             </w:r>
           </w:p>
         </w:tc>
@@ -3410,7 +3125,7 @@
               <w:rPr>
                 <w:sz w:val="19"/>
               </w:rPr>
-              <w:t>Compelling event</w:t>
+              <w:t>Reason to retreat</w:t>
             </w:r>
           </w:p>
         </w:tc>
@@ -3440,7 +3155,7 @@
               <w:rPr>
                 <w:sz w:val="19"/>
               </w:rPr>
-              <w:t>A knock comes from the side just checked</w:t>
+              <w:t>The outside feels less comfortable as evening fades</w:t>
             </w:r>
           </w:p>
         </w:tc>
@@ -3470,102 +3185,7 @@
               <w:rPr>
                 <w:sz w:val="19"/>
               </w:rPr>
-              <w:t>After return, play three localized knocks; handle moves if locked</w:t>
-            </w:r>
-          </w:p>
-        </w:tc>
-      </w:tr>
-      <w:tr>
-        <w:trPr>
-          <w:cantSplit/>
-        </w:trPr>
-        <w:tc>
-          <w:tcPr>
-            <w:tcW w:type="dxa" w:w="1512"/>
-            <w:vAlign w:val="center"/>
-            <w:shd w:fill="FFFFFF"/>
-            <w:tcBorders>
-              <w:top w:val="single" w:sz="4" w:color="D9D9D9"/>
-              <w:left w:val="single" w:sz="4" w:color="D9D9D9"/>
-              <w:bottom w:val="single" w:sz="4" w:color="D9D9D9"/>
-              <w:right w:val="single" w:sz="4" w:color="D9D9D9"/>
-            </w:tcBorders>
-            <w:tcMar>
-              <w:top w:w="95" w:type="dxa"/>
-              <w:left w:w="95" w:type="dxa"/>
-              <w:bottom w:w="95" w:type="dxa"/>
-              <w:right w:w="95" w:type="dxa"/>
-            </w:tcMar>
-          </w:tcPr>
-          <w:p>
-            <w:pPr>
-              <w:spacing w:after="40" w:line="247" w:lineRule="auto"/>
-            </w:pPr>
-            <w:r>
-              <w:rPr>
-                <w:sz w:val="19"/>
-              </w:rPr>
-              <w:t>Consequence</w:t>
-            </w:r>
-          </w:p>
-        </w:tc>
-        <w:tc>
-          <w:tcPr>
-            <w:tcW w:type="dxa" w:w="3384"/>
-            <w:vAlign w:val="center"/>
-            <w:shd w:fill="FFFFFF"/>
-            <w:tcBorders>
-              <w:top w:val="single" w:sz="4" w:color="D9D9D9"/>
-              <w:left w:val="single" w:sz="4" w:color="D9D9D9"/>
-              <w:bottom w:val="single" w:sz="4" w:color="D9D9D9"/>
-              <w:right w:val="single" w:sz="4" w:color="D9D9D9"/>
-            </w:tcBorders>
-            <w:tcMar>
-              <w:top w:w="95" w:type="dxa"/>
-              <w:left w:w="95" w:type="dxa"/>
-              <w:bottom w:w="95" w:type="dxa"/>
-              <w:right w:w="95" w:type="dxa"/>
-            </w:tcMar>
-          </w:tcPr>
-          <w:p>
-            <w:pPr>
-              <w:spacing w:after="40" w:line="247" w:lineRule="auto"/>
-            </w:pPr>
-            <w:r>
-              <w:rPr>
-                <w:sz w:val="19"/>
-              </w:rPr>
-              <w:t>The player tests the safety they established</w:t>
-            </w:r>
-          </w:p>
-        </w:tc>
-        <w:tc>
-          <w:tcPr>
-            <w:tcW w:type="dxa" w:w="5040"/>
-            <w:vAlign w:val="center"/>
-            <w:shd w:fill="FFFFFF"/>
-            <w:tcBorders>
-              <w:top w:val="single" w:sz="4" w:color="D9D9D9"/>
-              <w:left w:val="single" w:sz="4" w:color="D9D9D9"/>
-              <w:bottom w:val="single" w:sz="4" w:color="D9D9D9"/>
-              <w:right w:val="single" w:sz="4" w:color="D9D9D9"/>
-            </w:tcBorders>
-            <w:tcMar>
-              <w:top w:w="95" w:type="dxa"/>
-              <w:left w:w="95" w:type="dxa"/>
-              <w:bottom w:w="95" w:type="dxa"/>
-              <w:right w:w="95" w:type="dxa"/>
-            </w:tcMar>
-          </w:tcPr>
-          <w:p>
-            <w:pPr>
-              <w:spacing w:after="40" w:line="247" w:lineRule="auto"/>
-            </w:pPr>
-            <w:r>
-              <w:rPr>
-                <w:sz w:val="19"/>
-              </w:rPr>
-              <w:t>Locked: threat withdraws. Unlocked: brief encounter or recovery beat</w:t>
+              <w:t>One nearby disturbance; objective clearly points back to the van</w:t>
             </w:r>
           </w:p>
         </w:tc>
@@ -3600,7 +3220,7 @@
               <w:rPr>
                 <w:sz w:val="19"/>
               </w:rPr>
-              <w:t>Morning</w:t>
+              <w:t>Shelter and preparation</w:t>
             </w:r>
           </w:p>
         </w:tc>
@@ -3630,7 +3250,7 @@
               <w:rPr>
                 <w:sz w:val="19"/>
               </w:rPr>
-              <w:t>The familiar campsite looks changed</w:t>
+              <w:t>Enter at night and decide whether to lock up</w:t>
             </w:r>
           </w:p>
         </w:tc>
@@ -3660,7 +3280,292 @@
               <w:rPr>
                 <w:sz w:val="19"/>
               </w:rPr>
-              <w:t>Resolve the episode with one subtle trace and a quiet exit</w:t>
+              <w:t>Task resolved and player inside at night; allow time to close and lock without automatic locking</w:t>
+            </w:r>
+          </w:p>
+        </w:tc>
+      </w:tr>
+      <w:tr>
+        <w:trPr>
+          <w:cantSplit/>
+        </w:trPr>
+        <w:tc>
+          <w:tcPr>
+            <w:tcW w:type="dxa" w:w="1512"/>
+            <w:vAlign w:val="center"/>
+            <w:shd w:fill="F0F3F4"/>
+            <w:tcBorders>
+              <w:top w:val="single" w:sz="4" w:color="D9D9D9"/>
+              <w:left w:val="single" w:sz="4" w:color="D9D9D9"/>
+              <w:bottom w:val="single" w:sz="4" w:color="D9D9D9"/>
+              <w:right w:val="single" w:sz="4" w:color="D9D9D9"/>
+            </w:tcBorders>
+            <w:tcMar>
+              <w:top w:w="95" w:type="dxa"/>
+              <w:left w:w="95" w:type="dxa"/>
+              <w:bottom w:w="95" w:type="dxa"/>
+              <w:right w:w="95" w:type="dxa"/>
+            </w:tcMar>
+          </w:tcPr>
+          <w:p>
+            <w:pPr>
+              <w:spacing w:after="40" w:line="247" w:lineRule="auto"/>
+            </w:pPr>
+            <w:r>
+              <w:rPr>
+                <w:sz w:val="19"/>
+              </w:rPr>
+              <w:t>Boundary test</w:t>
+            </w:r>
+          </w:p>
+        </w:tc>
+        <w:tc>
+          <w:tcPr>
+            <w:tcW w:type="dxa" w:w="3384"/>
+            <w:vAlign w:val="center"/>
+            <w:shd w:fill="F0F3F4"/>
+            <w:tcBorders>
+              <w:top w:val="single" w:sz="4" w:color="D9D9D9"/>
+              <w:left w:val="single" w:sz="4" w:color="D9D9D9"/>
+              <w:bottom w:val="single" w:sz="4" w:color="D9D9D9"/>
+              <w:right w:val="single" w:sz="4" w:color="D9D9D9"/>
+            </w:tcBorders>
+            <w:tcMar>
+              <w:top w:w="95" w:type="dxa"/>
+              <w:left w:w="95" w:type="dxa"/>
+              <w:bottom w:w="95" w:type="dxa"/>
+              <w:right w:w="95" w:type="dxa"/>
+            </w:tcMar>
+          </w:tcPr>
+          <w:p>
+            <w:pPr>
+              <w:spacing w:after="40" w:line="247" w:lineRule="auto"/>
+            </w:pPr>
+            <w:r>
+              <w:rPr>
+                <w:sz w:val="19"/>
+              </w:rPr>
+              <w:t>Footsteps stop, knocks follow, then the handle is tried</w:t>
+            </w:r>
+          </w:p>
+        </w:tc>
+        <w:tc>
+          <w:tcPr>
+            <w:tcW w:type="dxa" w:w="5040"/>
+            <w:vAlign w:val="center"/>
+            <w:shd w:fill="F0F3F4"/>
+            <w:tcBorders>
+              <w:top w:val="single" w:sz="4" w:color="D9D9D9"/>
+              <w:left w:val="single" w:sz="4" w:color="D9D9D9"/>
+              <w:bottom w:val="single" w:sz="4" w:color="D9D9D9"/>
+              <w:right w:val="single" w:sz="4" w:color="D9D9D9"/>
+            </w:tcBorders>
+            <w:tcMar>
+              <w:top w:w="95" w:type="dxa"/>
+              <w:left w:w="95" w:type="dxa"/>
+              <w:bottom w:w="95" w:type="dxa"/>
+              <w:right w:w="95" w:type="dxa"/>
+            </w:tcMar>
+          </w:tcPr>
+          <w:p>
+            <w:pPr>
+              <w:spacing w:after="40" w:line="247" w:lineRule="auto"/>
+            </w:pPr>
+            <w:r>
+              <w:rPr>
+                <w:sz w:val="19"/>
+              </w:rPr>
+              <w:t>One authored sequence after a quiet delay; evaluate current door state at the attempt</w:t>
+            </w:r>
+          </w:p>
+        </w:tc>
+      </w:tr>
+      <w:tr>
+        <w:trPr>
+          <w:cantSplit/>
+        </w:trPr>
+        <w:tc>
+          <w:tcPr>
+            <w:tcW w:type="dxa" w:w="1512"/>
+            <w:vAlign w:val="center"/>
+            <w:shd w:fill="F0F3F4"/>
+            <w:tcBorders>
+              <w:top w:val="single" w:sz="4" w:color="D9D9D9"/>
+              <w:left w:val="single" w:sz="4" w:color="D9D9D9"/>
+              <w:bottom w:val="single" w:sz="4" w:color="D9D9D9"/>
+              <w:right w:val="single" w:sz="4" w:color="D9D9D9"/>
+            </w:tcBorders>
+            <w:tcMar>
+              <w:top w:w="95" w:type="dxa"/>
+              <w:left w:w="95" w:type="dxa"/>
+              <w:bottom w:w="95" w:type="dxa"/>
+              <w:right w:w="95" w:type="dxa"/>
+            </w:tcMar>
+          </w:tcPr>
+          <w:p>
+            <w:pPr>
+              <w:spacing w:after="40" w:line="247" w:lineRule="auto"/>
+            </w:pPr>
+            <w:r>
+              <w:rPr>
+                <w:sz w:val="19"/>
+              </w:rPr>
+              <w:t>Consequence</w:t>
+            </w:r>
+          </w:p>
+        </w:tc>
+        <w:tc>
+          <w:tcPr>
+            <w:tcW w:type="dxa" w:w="3384"/>
+            <w:vAlign w:val="center"/>
+            <w:shd w:fill="F0F3F4"/>
+            <w:tcBorders>
+              <w:top w:val="single" w:sz="4" w:color="D9D9D9"/>
+              <w:left w:val="single" w:sz="4" w:color="D9D9D9"/>
+              <w:bottom w:val="single" w:sz="4" w:color="D9D9D9"/>
+              <w:right w:val="single" w:sz="4" w:color="D9D9D9"/>
+            </w:tcBorders>
+            <w:tcMar>
+              <w:top w:w="95" w:type="dxa"/>
+              <w:left w:w="95" w:type="dxa"/>
+              <w:bottom w:w="95" w:type="dxa"/>
+              <w:right w:w="95" w:type="dxa"/>
+            </w:tcMar>
+          </w:tcPr>
+          <w:p>
+            <w:pPr>
+              <w:spacing w:after="40" w:line="247" w:lineRule="auto"/>
+            </w:pPr>
+            <w:r>
+              <w:rPr>
+                <w:sz w:val="19"/>
+              </w:rPr>
+              <w:t>Preparation changes the response</w:t>
+            </w:r>
+          </w:p>
+        </w:tc>
+        <w:tc>
+          <w:tcPr>
+            <w:tcW w:type="dxa" w:w="5040"/>
+            <w:vAlign w:val="center"/>
+            <w:shd w:fill="F0F3F4"/>
+            <w:tcBorders>
+              <w:top w:val="single" w:sz="4" w:color="D9D9D9"/>
+              <w:left w:val="single" w:sz="4" w:color="D9D9D9"/>
+              <w:bottom w:val="single" w:sz="4" w:color="D9D9D9"/>
+              <w:right w:val="single" w:sz="4" w:color="D9D9D9"/>
+            </w:tcBorders>
+            <w:tcMar>
+              <w:top w:w="95" w:type="dxa"/>
+              <w:left w:w="95" w:type="dxa"/>
+              <w:bottom w:w="95" w:type="dxa"/>
+              <w:right w:w="95" w:type="dxa"/>
+            </w:tcMar>
+          </w:tcPr>
+          <w:p>
+            <w:pPr>
+              <w:spacing w:after="40" w:line="247" w:lineRule="auto"/>
+            </w:pPr>
+            <w:r>
+              <w:rPr>
+                <w:sz w:val="19"/>
+              </w:rPr>
+              <w:t>Locked: door holds and visitor withdraws. Unlocked or open: distinct consequence remains OPEN</w:t>
+            </w:r>
+          </w:p>
+        </w:tc>
+      </w:tr>
+      <w:tr>
+        <w:trPr>
+          <w:cantSplit/>
+        </w:trPr>
+        <w:tc>
+          <w:tcPr>
+            <w:tcW w:type="dxa" w:w="1512"/>
+            <w:vAlign w:val="center"/>
+            <w:shd w:fill="F0F3F4"/>
+            <w:tcBorders>
+              <w:top w:val="single" w:sz="4" w:color="D9D9D9"/>
+              <w:left w:val="single" w:sz="4" w:color="D9D9D9"/>
+              <w:bottom w:val="single" w:sz="4" w:color="D9D9D9"/>
+              <w:right w:val="single" w:sz="4" w:color="D9D9D9"/>
+            </w:tcBorders>
+            <w:tcMar>
+              <w:top w:w="95" w:type="dxa"/>
+              <w:left w:w="95" w:type="dxa"/>
+              <w:bottom w:w="95" w:type="dxa"/>
+              <w:right w:w="95" w:type="dxa"/>
+            </w:tcMar>
+          </w:tcPr>
+          <w:p>
+            <w:pPr>
+              <w:spacing w:after="40" w:line="247" w:lineRule="auto"/>
+            </w:pPr>
+            <w:r>
+              <w:rPr>
+                <w:sz w:val="19"/>
+              </w:rPr>
+              <w:t>Resolution</w:t>
+            </w:r>
+          </w:p>
+        </w:tc>
+        <w:tc>
+          <w:tcPr>
+            <w:tcW w:type="dxa" w:w="3384"/>
+            <w:vAlign w:val="center"/>
+            <w:shd w:fill="F0F3F4"/>
+            <w:tcBorders>
+              <w:top w:val="single" w:sz="4" w:color="D9D9D9"/>
+              <w:left w:val="single" w:sz="4" w:color="D9D9D9"/>
+              <w:bottom w:val="single" w:sz="4" w:color="D9D9D9"/>
+              <w:right w:val="single" w:sz="4" w:color="D9D9D9"/>
+            </w:tcBorders>
+            <w:tcMar>
+              <w:top w:w="95" w:type="dxa"/>
+              <w:left w:w="95" w:type="dxa"/>
+              <w:bottom w:w="95" w:type="dxa"/>
+              <w:right w:w="95" w:type="dxa"/>
+            </w:tcMar>
+          </w:tcPr>
+          <w:p>
+            <w:pPr>
+              <w:spacing w:after="40" w:line="247" w:lineRule="auto"/>
+            </w:pPr>
+            <w:r>
+              <w:rPr>
+                <w:sz w:val="19"/>
+              </w:rPr>
+              <w:t>The first encounter ends clearly and can restart</w:t>
+            </w:r>
+          </w:p>
+        </w:tc>
+        <w:tc>
+          <w:tcPr>
+            <w:tcW w:type="dxa" w:w="5040"/>
+            <w:vAlign w:val="center"/>
+            <w:shd w:fill="F0F3F4"/>
+            <w:tcBorders>
+              <w:top w:val="single" w:sz="4" w:color="D9D9D9"/>
+              <w:left w:val="single" w:sz="4" w:color="D9D9D9"/>
+              <w:bottom w:val="single" w:sz="4" w:color="D9D9D9"/>
+              <w:right w:val="single" w:sz="4" w:color="D9D9D9"/>
+            </w:tcBorders>
+            <w:tcMar>
+              <w:top w:w="95" w:type="dxa"/>
+              <w:left w:w="95" w:type="dxa"/>
+              <w:bottom w:w="95" w:type="dxa"/>
+              <w:right w:w="95" w:type="dxa"/>
+            </w:tcMar>
+          </w:tcPr>
+          <w:p>
+            <w:pPr>
+              <w:spacing w:after="40" w:line="247" w:lineRule="auto"/>
+            </w:pPr>
+            <w:r>
+              <w:rPr>
+                <w:sz w:val="19"/>
+              </w:rPr>
+              <w:t>Proposed quiet withdrawal or morning beat; reset every phase and cue</w:t>
             </w:r>
           </w:p>
         </w:tc>
@@ -3681,7 +3586,7 @@
     </w:p>
     <w:p>
       <w:r>
-        <w:t>It links anticipation, a vulnerable outdoor trip and manual locks. The same van changes meaning without needing a large enemy system. The lock state affects the result, so preparation has a visible consequence. The identity and explanation of the visitor remain open.</w:t>
+        <w:t>An ordinary task gives the player a focus while the campsite becomes less comfortable. Returning changes the van from a familiar object into an active refuge. The handle attempt makes closing and locking observable decisions. Keep the visitor’s identity and the cause of the disturbance unresolved.</w:t>
       </w:r>
     </w:p>
     <w:p>
@@ -3727,11 +3632,102 @@
     <w:p>
       <w:pPr>
         <w:pStyle w:val="Subtitle"/>
+        <w:pageBreakBefore/>
+      </w:pPr>
+      <w:r>
+        <w:t>06    DESIGN AND PRODUCTION</w:t>
+      </w:r>
+    </w:p>
+    <w:p>
+      <w:pPr>
+        <w:pStyle w:val="Heading1"/>
+      </w:pPr>
+      <w:r>
+        <w:t>Campsite routines and disturbance cues</w:t>
+      </w:r>
+    </w:p>
+    <w:p>
+      <w:pPr>
+        <w:pStyle w:val="Heading2"/>
+      </w:pPr>
+      <w:r>
+        <w:t>Ordinary tasks establish the baseline</w:t>
+      </w:r>
+    </w:p>
+    <w:p>
+      <w:pPr/>
+      <w:r>
+        <w:t>CONFIRMED direction — The player spends day or evening outside doing ordinary campsite activities while unease grows. Firewood collection, preparing a fire and cooking food are candidate activities. They are not a requirement to build three interconnected systems in the first prototype.</w:t>
+      </w:r>
+    </w:p>
+    <w:p>
+      <w:pPr/>
+      <w:r>
+        <w:t>PROPOSED first slice — Interact with one firewood bundle, carry or represent that bundle simply, and place it at the fire. A task flag is sufficient. Keep the route short and legible; introduce no hunger, fuel economy, crafting tree or large inventory. Fire lighting and cooking can follow after this loop works.</w:t>
+      </w:r>
+    </w:p>
+    <w:p>
+      <w:pPr>
+        <w:pStyle w:val="Heading2"/>
+      </w:pPr>
+      <w:r>
+        <w:t>Outdoor cues during day and evening</w:t>
+      </w:r>
+    </w:p>
+    <w:p>
+      <w:pPr/>
+      <w:r>
+        <w:t>PROPOSED — Start with one spatial branch snap or movement sound while the player is occupied. Let silence follow. A later nearby sound can give a readable reason to return to the van as evening darkens. Avoid repeatedly interrupting the task or silently timing out a slower player.</w:t>
+      </w:r>
+    </w:p>
+    <w:p>
+      <w:pPr/>
+      <w:r>
+        <w:t>PROPOSED candidate cue — Stage a distant figure at a controlled sightline. Once seen, remove it only after the player looks away; a second look finds the space empty. Do not spawn or disappear in an obviously watched location. Define visibility checks and a reset before using this cue; the figure needs no patrol or combat AI.</w:t>
+      </w:r>
+    </w:p>
+    <w:p>
+      <w:pPr>
+        <w:pStyle w:val="Heading2"/>
+      </w:pPr>
+      <w:r>
+        <w:t>Nighttime cues around the van</w:t>
+      </w:r>
+    </w:p>
+    <w:p>
+      <w:pPr/>
+      <w:r>
+        <w:t>CONFIRMED direction — Once the player is sheltering inside at night, sounds outside test the feeling of safety. Footsteps around the van and knocks support the first boundary test. Whispers and laughter are candidate later cues, not a continuous layer or a mandatory set in every run.</w:t>
+      </w:r>
+    </w:p>
+    <w:p>
+      <w:pPr/>
+      <w:r>
+        <w:t>PROPOSED candidate cue — Suggest a vehicle with two headlights and engine audio. A short authored path approaches the van, stops with the lights on it, then reverses or withdraws and drives off. Use one Blueprint presentation actor and a Timeline or short sequence; a modeled car, real driving and vehicle physics are unnecessary.</w:t>
+      </w:r>
+    </w:p>
+    <w:p>
+      <w:pPr>
+        <w:pStyle w:val="Heading2"/>
+      </w:pPr>
+      <w:r>
+        <w:t>Use cues selectively</w:t>
+      </w:r>
+    </w:p>
+    <w:p>
+      <w:pPr/>
+      <w:r>
+        <w:t>Give each cue a purpose and a recovery interval. First prove one outdoor sound and the night boundary test. Add the figure or headlights one at a time if they improve the player’s understanding or tension. Keep normal ambience quiet enough for important sounds and their captions to remain readable.</w:t>
+      </w:r>
+    </w:p>
+    <w:p>
+      <w:pPr>
+        <w:pStyle w:val="Subtitle"/>
         <w:keepNext/>
         <w:pageBreakBefore/>
       </w:pPr>
       <w:r>
-        <w:t>06    DESIGN AND PRODUCTION</w:t>
+        <w:t>07    DESIGN AND PRODUCTION</w:t>
       </w:r>
     </w:p>
     <w:p>
@@ -3788,7 +3784,7 @@
     </w:p>
     <w:p>
       <w:r>
-        <w:t>PROPOSED layout — Place the van in a clearing, a water point or bathroom along one readable path, a road beyond partial tree cover and two controlled offscreen sound positions. Keep the playable boundary modest and justified by terrain. An approximately 30–60 second walk to the task is a tuning starting point, not a fixed distance.</w:t>
+        <w:t>PROPOSED layout — Place the van and fire in a clearing, one nearby firewood pickup, a recognizable return landmark, distant figure staging and a hidden road approach for headlights. Keep one readable outdoor route. Reserve water or bathroom locations for a later task only if the first encounter earns the added scope.</w:t>
       </w:r>
     </w:p>
     <w:p>
@@ -3820,7 +3816,7 @@
         <w:ind w:left="173" w:hanging="173"/>
       </w:pPr>
       <w:r>
-        <w:t>•  Event staging: reserve a hidden approach or sound anchor near the van; keep the outdoor task accessible regardless of door state.</w:t>
+        <w:t>•  Event staging: reserve sound anchors around the van and a hidden light approach. Keep the firewood task and return route accessible when the door is open, closed or locked. Avoid placing essential controls where a moving panel hides them.</w:t>
       </w:r>
     </w:p>
     <w:p>
@@ -3843,7 +3839,7 @@
         <w:pageBreakBefore/>
       </w:pPr>
       <w:r>
-        <w:t>07    DESIGN AND PRODUCTION</w:t>
+        <w:t>08    DESIGN AND PRODUCTION</w:t>
       </w:r>
     </w:p>
     <w:p>
@@ -4409,7 +4405,7 @@
               <w:rPr>
                 <w:sz w:val="19"/>
               </w:rPr>
-              <w:t>Footsteps, knocks and one distant vehicle cue</w:t>
+              <w:t>Footsteps and knocks first; whispers, laughter, figure and headlights are candidate additions</w:t>
             </w:r>
           </w:p>
         </w:tc>
@@ -4540,7 +4536,7 @@
         <w:pageBreakBefore/>
       </w:pPr>
       <w:r>
-        <w:t>08    DESIGN AND PRODUCTION</w:t>
+        <w:t>09    DESIGN AND PRODUCTION</w:t>
       </w:r>
     </w:p>
     <w:p>
@@ -5066,7 +5062,7 @@
               <w:rPr>
                 <w:sz w:val="19"/>
               </w:rPr>
-              <w:t>Complete close, lock and water task using alternate bindings</w:t>
+              <w:t>Complete close, lock and the outdoor task using alternate bindings</w:t>
             </w:r>
           </w:p>
         </w:tc>
@@ -5305,7 +5301,7 @@
         <w:pageBreakBefore/>
       </w:pPr>
       <w:r>
-        <w:t>09    DESIGN AND PRODUCTION</w:t>
+        <w:t>10    DESIGN AND PRODUCTION</w:t>
       </w:r>
     </w:p>
     <w:p>
@@ -5559,10 +5555,7 @@
               <w:spacing w:after="40" w:line="247" w:lineRule="auto"/>
             </w:pPr>
             <w:r>
-              <w:rPr>
-                <w:sz w:val="19"/>
-              </w:rPr>
-              <w:t>Door component with validated state changes</w:t>
+              <w:t>Door owner with validated open and lock operations</w:t>
             </w:r>
           </w:p>
         </w:tc>
@@ -5589,10 +5582,7 @@
               <w:spacing w:after="40" w:line="247" w:lineRule="auto"/>
             </w:pPr>
             <w:r>
-              <w:rPr>
-                <w:sz w:val="19"/>
-              </w:rPr>
-              <w:t>Van meshes, hinge animation and handle presentation</w:t>
+              <w:t>Van assembly, door movement, handle and lock presentation</w:t>
             </w:r>
           </w:p>
         </w:tc>
@@ -5624,10 +5614,7 @@
               <w:spacing w:after="40" w:line="247" w:lineRule="auto"/>
             </w:pPr>
             <w:r>
-              <w:rPr>
-                <w:sz w:val="19"/>
-              </w:rPr>
-              <w:t>Night sequence state and one-shot event tracking</w:t>
+              <w:t>Small night phase and event flags only where native logic is useful</w:t>
             </w:r>
           </w:p>
         </w:tc>
@@ -5654,10 +5641,7 @@
               <w:spacing w:after="40" w:line="247" w:lineRule="auto"/>
             </w:pPr>
             <w:r>
-              <w:rPr>
-                <w:sz w:val="19"/>
-              </w:rPr>
-              <w:t>Event order, delays, cue positions and conditional branches</w:t>
+              <w:t>Placed director, editable settings, cue presentation and authored timing</w:t>
             </w:r>
           </w:p>
         </w:tc>
@@ -5813,7 +5797,7 @@
     </w:p>
     <w:p>
       <w:r>
-        <w:t>A compact episode definition can hold beat identifiers, prerequisites and tuning values. Start with a direct authored sequence if that is quicker; generalize only after the second sequence needs the same behavior. Multiplayer replication is outside the prototype.</w:t>
+        <w:t>PROPOSED approach — One placed night director owns a short authored phase sequence. Keep cue references, delays and placements editable; use a small encounter settings asset only where shared configurations earn it. A few explicit settings are sufficient for the first encounter. Generalize after a second real sequence demonstrates reuse.</w:t>
       </w:r>
     </w:p>
     <w:p>
@@ -5826,7 +5810,7 @@
     </w:p>
     <w:p>
       <w:r>
-        <w:t>Store current beat, completed one-shot events, objective flags, door state and the selected lighting state at a single safe checkpoint. Cancel active timers and effects before restoring. Provide developer controls to jump to a beat, reset the night and display current state. Seed any timing variation for repeatable testing.</w:t>
+        <w:t>PROPOSED debugging — Provide a deterministic reset and a way to jump to the phase under test. Cancel timers, stop active audio, hide the figure, restore headlights and UDS presentation, and clear one-shot and objective flags. Restore door state through its validated operations. A checkpoint or save system remains a separate proposal, not a requirement for the first encounter.</w:t>
       </w:r>
     </w:p>
     <w:p>
@@ -5850,11 +5834,108 @@
     <w:p>
       <w:pPr>
         <w:pStyle w:val="Subtitle"/>
+        <w:pageBreakBefore/>
+      </w:pPr>
+      <w:r>
+        <w:t>11    DESIGN AND PRODUCTION</w:t>
+      </w:r>
+    </w:p>
+    <w:p>
+      <w:pPr>
+        <w:pStyle w:val="Heading1"/>
+      </w:pPr>
+      <w:r>
+        <w:t>Encounter authoring and state ownership</w:t>
+      </w:r>
+    </w:p>
+    <w:p>
+      <w:pPr>
+        <w:pStyle w:val="Heading2"/>
+      </w:pPr>
+      <w:r>
+        <w:t>A small authored sequence with tunable data</w:t>
+      </w:r>
+    </w:p>
+    <w:p>
+      <w:pPr/>
+      <w:r>
+        <w:t>PROPOSED — Begin with one placed night director and a short phase sequence: outdoor task, outdoor unease, retreat, shelter, boundary test and resolution. Keep stable validation in existing gameplay owners. Author the sequence and presentation in Blueprint unless native complexity or testing needs justify moving a specific part to C++.</w:t>
+      </w:r>
+    </w:p>
+    <w:p>
+      <w:pPr/>
+      <w:r>
+        <w:t>Expose cue actor references, sound assets, delays, placements, objective text and a few timing ranges for tuning. A small encounter settings Data Asset is appropriate when repeated configurations make it useful. Do not create a generic quest editor, string-based function dispatcher, global event bus or procedural scare scheduler for one night.</w:t>
+      </w:r>
+    </w:p>
+    <w:p>
+      <w:pPr>
+        <w:pStyle w:val="Heading2"/>
+      </w:pPr>
+      <w:r>
+        <w:t>Ownership and communication</w:t>
+      </w:r>
+    </w:p>
+    <w:p>
+      <w:pPr/>
+      <w:r>
+        <w:t>The director owns phase, current objective and one-shot event flags. Task actors report meaningful completion through the existing interaction path. Cue actors own figure visibility, spatial sound or the headlight presentation. UI displays objective and feedback; it does not advance the encounter or store a second lock state.</w:t>
+      </w:r>
+    </w:p>
+    <w:p>
+      <w:pPr/>
+      <w:r>
+        <w:t>The van remains the door and lock authority. At the handle attempt, query the live state rather than remembering whether it was locked on entry. A locked door holds. An unlocked closed door may open only through its validated operation and clearance checks. If the door is already open, use an explicit open-door response; never wait indefinitely for an impossible close or lock prerequisite.</w:t>
+      </w:r>
+    </w:p>
+    <w:p>
+      <w:pPr/>
+      <w:r>
+        <w:t>Use the existing project-owned UDS integration for day, evening and night changes. One authority advances environmental time. The director requests a presentation change; critical events use phase prerequisites rather than exact clock equality. Keep UDS calls out of individual props and cues.</w:t>
+      </w:r>
+    </w:p>
+    <w:p>
+      <w:pPr>
+        <w:pStyle w:val="Heading2"/>
+      </w:pPr>
+      <w:r>
+        <w:t>Dependable progression and restrained variation</w:t>
+      </w:r>
+    </w:p>
+    <w:p>
+      <w:pPr/>
+      <w:r>
+        <w:t>Critical beats have explicit prerequisites and fire once. Begin the first inside disturbance after the outdoor objective is resolved, the player is inside at night and a quiet delay has elapsed. Leave an opportunity to prepare, but do not require a locked door to trigger the event. Support early return and subsequent task completion without losing progress.</w:t>
+      </w:r>
+    </w:p>
+    <w:p>
+      <w:pPr/>
+      <w:r>
+        <w:t>Ambient cues may vary within small timing ranges, with cooldowns and overlap limits. Suspend or defer them during critical sounds. Repeated interaction must not duplicate a phase or restart a scare. Variation must never prevent completion; a deterministic development mode should reproduce the sequence.</w:t>
+      </w:r>
+    </w:p>
+    <w:p>
+      <w:pPr>
+        <w:pStyle w:val="Heading2"/>
+      </w:pPr>
+      <w:r>
+        <w:t>Acceptance and unresolved behavior</w:t>
+      </w:r>
+    </w:p>
+    <w:p>
+      <w:pPr/>
+      <w:r>
+        <w:t>Acceptance: complete the task and retreat; observe distinct locked and unlocked responses; freely unlock from inside; finish and reset twice without duplicate cues or stale timers. Check early return, waiting, an open door, a blocked opening and pausing. OPEN: the exact unlocked consequence, response opportunity and final resolution. Decide these before implementing dependent effects.</w:t>
+      </w:r>
+    </w:p>
+    <w:p>
+      <w:pPr>
+        <w:pStyle w:val="Subtitle"/>
         <w:keepNext/>
         <w:pageBreakBefore/>
       </w:pPr>
       <w:r>
-        <w:t>10    DESIGN AND PRODUCTION</w:t>
+        <w:t>12    DESIGN AND PRODUCTION</w:t>
       </w:r>
     </w:p>
     <w:p>
@@ -6329,7 +6410,7 @@
               <w:rPr>
                 <w:sz w:val="19"/>
               </w:rPr>
-              <w:t>One outdoor need</w:t>
+              <w:t>One ordinary outdoor task</w:t>
             </w:r>
           </w:p>
         </w:tc>
@@ -6359,7 +6440,7 @@
               <w:rPr>
                 <w:sz w:val="19"/>
               </w:rPr>
-              <w:t>Task advances once and does not require survival meters</w:t>
+              <w:t>Task advances once; no survival meter or general crafting system</w:t>
             </w:r>
           </w:p>
         </w:tc>
@@ -6454,7 +6535,7 @@
               <w:rPr>
                 <w:sz w:val="19"/>
               </w:rPr>
-              <w:t>Footsteps, outing and boundary test occur in the intended order</w:t>
+              <w:t>Routine, retreat and nighttime boundary test complete in order; door state changes the response</w:t>
             </w:r>
           </w:p>
         </w:tc>
@@ -6858,7 +6939,7 @@
         <w:ind w:left="173" w:hanging="173"/>
       </w:pPr>
       <w:r>
-        <w:t>•  Complete the locked and unlocked door branches. Attempt locking while open, repeated interaction, interruption and reload at the checkpoint.</w:t>
+        <w:t>•  Complete both lock responses. Check the actual lock state at the handle attempt, allow inside unlocking, and verify that an already-open door does not stall the encounter. Do not force an invalid lock or bypass a locked door.</w:t>
       </w:r>
     </w:p>
     <w:p>
@@ -6874,7 +6955,7 @@
         <w:ind w:left="173" w:hanging="173"/>
       </w:pPr>
       <w:r>
-        <w:t>•  Wait inside without progressing; revisit the task trigger; return early; pause during a cue. Verify no deadlock, duplicate event or missing objective.</w:t>
+        <w:t>•  Return early, delay the task, wait inside, pause during a cue, and repeat the night. Confirm that ambient cues do not overlap critical beats, events fire once, and reset clears audio, figure visibility, lights, timers and objectives.</w:t>
       </w:r>
     </w:p>
     <w:p>
@@ -6910,7 +6991,7 @@
         <w:pageBreakBefore/>
       </w:pPr>
       <w:r>
-        <w:t>11    DESIGN AND PRODUCTION</w:t>
+        <w:t>13    DESIGN AND PRODUCTION</w:t>
       </w:r>
     </w:p>
     <w:p>
@@ -8111,7 +8192,7 @@
     </w:p>
     <w:p>
       <w:r>
-        <w:t>If the milestone slips, cut vlog footage, travel polish, extra props and weather variation first. Preserve movement, manual locks, the outdoor risk and one effective horror event. If those cannot coexist clearly, reduce the campsite and sequence before adding new systems.</w:t>
+        <w:t>If the milestone slips, cut cooking, extra chores, additional cue types, vlog footage, travel polish and weather variation first. Preserve one outdoor task, a reason to retreat, manual locking and one complete disturbance with a clear resolution. Expand only after that loop is understandable and reliable.</w:t>
       </w:r>
     </w:p>
     <w:p>
@@ -8121,7 +8202,7 @@
         <w:pageBreakBefore/>
       </w:pPr>
       <w:r>
-        <w:t>12    DESIGN AND PRODUCTION</w:t>
+        <w:t>14    DESIGN AND PRODUCTION</w:t>
       </w:r>
     </w:p>
     <w:p>
@@ -8134,7 +8215,7 @@
     </w:p>
     <w:p>
       <w:r>
-        <w:t>This is the initial decision record. CONFIRMED rows restate the current brief. PROPOSED and OPEN rows require developer judgment or prototype evidence before becoming production commitments. Update this log when a choice changes.</w:t>
+        <w:t>CONFIRMED rows record the requested experience. PROPOSED rows remain implementation or content choices to evaluate. OPEN rows require a decision before dependent behavior is built. The campsite routine and retreat direction supersedes the earlier proposed water-outing sequence.</w:t>
       </w:r>
     </w:p>
     <w:tbl>
@@ -9094,7 +9175,7 @@
               <w:rPr>
                 <w:sz w:val="19"/>
               </w:rPr>
-              <w:t>Proposed</w:t>
+              <w:t>Confirmed</w:t>
             </w:r>
           </w:p>
         </w:tc>
@@ -9124,7 +9205,7 @@
               <w:rPr>
                 <w:sz w:val="19"/>
               </w:rPr>
-              <w:t>Knocks after a water outing as the first event</w:t>
+              <w:t>Outdoor routine, retreat and a lock-responsive night disturbance</w:t>
             </w:r>
           </w:p>
         </w:tc>
@@ -9154,7 +9235,7 @@
               <w:rPr>
                 <w:sz w:val="19"/>
               </w:rPr>
-              <w:t>Test whether players connect locking to outcome</w:t>
+              <w:t>Replaces proposed water-first sequence; prototype one small task</w:t>
             </w:r>
           </w:p>
         </w:tc>
@@ -9249,7 +9330,7 @@
               <w:rPr>
                 <w:sz w:val="19"/>
               </w:rPr>
-              <w:t>Death, capture, chase or nonlethal consequence</w:t>
+              <w:t>Unlocked-door consequence, failure and recovery</w:t>
             </w:r>
           </w:p>
         </w:tc>
@@ -9279,7 +9360,7 @@
               <w:rPr>
                 <w:sz w:val="19"/>
               </w:rPr>
-              <w:t>Choose the smallest readable recovery at M2</w:t>
+              <w:t>Decide before implementing; brief opening cue is a proposal</w:t>
             </w:r>
           </w:p>
         </w:tc>
@@ -9784,6 +9865,381 @@
           </w:p>
         </w:tc>
       </w:tr>
+      <w:tr>
+        <w:trPr>
+          <w:cantSplit/>
+        </w:trPr>
+        <w:tc>
+          <w:tcPr>
+            <w:tcW w:type="dxa" w:w="648"/>
+            <w:vAlign w:val="center"/>
+            <w:shd w:fill="FFFFFF"/>
+            <w:tcBorders>
+              <w:top w:val="single" w:sz="4" w:color="D9D9D9"/>
+              <w:left w:val="single" w:sz="4" w:color="D9D9D9"/>
+              <w:bottom w:val="single" w:sz="4" w:color="D9D9D9"/>
+              <w:right w:val="single" w:sz="4" w:color="D9D9D9"/>
+            </w:tcBorders>
+            <w:tcMar>
+              <w:top w:w="95" w:type="dxa"/>
+              <w:left w:w="95" w:type="dxa"/>
+              <w:bottom w:w="95" w:type="dxa"/>
+              <w:right w:w="95" w:type="dxa"/>
+            </w:tcMar>
+          </w:tcPr>
+          <w:p>
+            <w:pPr>
+              <w:spacing w:after="40" w:line="247" w:lineRule="auto"/>
+            </w:pPr>
+            <w:r>
+              <w:rPr>
+                <w:sz w:val="19"/>
+              </w:rPr>
+              <w:t>D13</w:t>
+            </w:r>
+          </w:p>
+        </w:tc>
+        <w:tc>
+          <w:tcPr>
+            <w:tcW w:type="dxa" w:w="1224"/>
+            <w:vAlign w:val="center"/>
+            <w:shd w:fill="FFFFFF"/>
+            <w:tcBorders>
+              <w:top w:val="single" w:sz="4" w:color="D9D9D9"/>
+              <w:left w:val="single" w:sz="4" w:color="D9D9D9"/>
+              <w:bottom w:val="single" w:sz="4" w:color="D9D9D9"/>
+              <w:right w:val="single" w:sz="4" w:color="D9D9D9"/>
+            </w:tcBorders>
+            <w:tcMar>
+              <w:top w:w="95" w:type="dxa"/>
+              <w:left w:w="95" w:type="dxa"/>
+              <w:bottom w:w="95" w:type="dxa"/>
+              <w:right w:w="95" w:type="dxa"/>
+            </w:tcMar>
+          </w:tcPr>
+          <w:p>
+            <w:pPr>
+              <w:spacing w:after="40" w:line="247" w:lineRule="auto"/>
+            </w:pPr>
+            <w:r>
+              <w:rPr>
+                <w:sz w:val="19"/>
+              </w:rPr>
+              <w:t>Proposed</w:t>
+            </w:r>
+          </w:p>
+        </w:tc>
+        <w:tc>
+          <w:tcPr>
+            <w:tcW w:type="dxa" w:w="4248"/>
+            <w:vAlign w:val="center"/>
+            <w:shd w:fill="FFFFFF"/>
+            <w:tcBorders>
+              <w:top w:val="single" w:sz="4" w:color="D9D9D9"/>
+              <w:left w:val="single" w:sz="4" w:color="D9D9D9"/>
+              <w:bottom w:val="single" w:sz="4" w:color="D9D9D9"/>
+              <w:right w:val="single" w:sz="4" w:color="D9D9D9"/>
+            </w:tcBorders>
+            <w:tcMar>
+              <w:top w:w="95" w:type="dxa"/>
+              <w:left w:w="95" w:type="dxa"/>
+              <w:bottom w:w="95" w:type="dxa"/>
+              <w:right w:w="95" w:type="dxa"/>
+            </w:tcMar>
+          </w:tcPr>
+          <w:p>
+            <w:pPr>
+              <w:spacing w:after="40" w:line="247" w:lineRule="auto"/>
+            </w:pPr>
+            <w:r>
+              <w:rPr>
+                <w:sz w:val="19"/>
+              </w:rPr>
+              <w:t>One placed director with editable cue settings</w:t>
+            </w:r>
+          </w:p>
+        </w:tc>
+        <w:tc>
+          <w:tcPr>
+            <w:tcW w:type="dxa" w:w="3816"/>
+            <w:vAlign w:val="center"/>
+            <w:shd w:fill="FFFFFF"/>
+            <w:tcBorders>
+              <w:top w:val="single" w:sz="4" w:color="D9D9D9"/>
+              <w:left w:val="single" w:sz="4" w:color="D9D9D9"/>
+              <w:bottom w:val="single" w:sz="4" w:color="D9D9D9"/>
+              <w:right w:val="single" w:sz="4" w:color="D9D9D9"/>
+            </w:tcBorders>
+            <w:tcMar>
+              <w:top w:w="95" w:type="dxa"/>
+              <w:left w:w="95" w:type="dxa"/>
+              <w:bottom w:w="95" w:type="dxa"/>
+              <w:right w:w="95" w:type="dxa"/>
+            </w:tcMar>
+          </w:tcPr>
+          <w:p>
+            <w:pPr>
+              <w:spacing w:after="40" w:line="247" w:lineRule="auto"/>
+            </w:pPr>
+            <w:r>
+              <w:rPr>
+                <w:sz w:val="19"/>
+              </w:rPr>
+              <w:t>Prove first sequence; add data assets when reuse earns them</w:t>
+            </w:r>
+          </w:p>
+        </w:tc>
+      </w:tr>
+      <w:tr>
+        <w:trPr>
+          <w:cantSplit/>
+        </w:trPr>
+        <w:tc>
+          <w:tcPr>
+            <w:tcW w:type="dxa" w:w="648"/>
+            <w:vAlign w:val="center"/>
+            <w:shd w:fill="FFFFFF"/>
+            <w:tcBorders>
+              <w:top w:val="single" w:sz="4" w:color="D9D9D9"/>
+              <w:left w:val="single" w:sz="4" w:color="D9D9D9"/>
+              <w:bottom w:val="single" w:sz="4" w:color="D9D9D9"/>
+              <w:right w:val="single" w:sz="4" w:color="D9D9D9"/>
+            </w:tcBorders>
+            <w:tcMar>
+              <w:top w:w="95" w:type="dxa"/>
+              <w:left w:w="95" w:type="dxa"/>
+              <w:bottom w:w="95" w:type="dxa"/>
+              <w:right w:w="95" w:type="dxa"/>
+            </w:tcMar>
+          </w:tcPr>
+          <w:p>
+            <w:pPr>
+              <w:spacing w:after="40" w:line="247" w:lineRule="auto"/>
+            </w:pPr>
+            <w:r>
+              <w:rPr>
+                <w:sz w:val="19"/>
+              </w:rPr>
+              <w:t>D14</w:t>
+            </w:r>
+          </w:p>
+        </w:tc>
+        <w:tc>
+          <w:tcPr>
+            <w:tcW w:type="dxa" w:w="1224"/>
+            <w:vAlign w:val="center"/>
+            <w:shd w:fill="FFFFFF"/>
+            <w:tcBorders>
+              <w:top w:val="single" w:sz="4" w:color="D9D9D9"/>
+              <w:left w:val="single" w:sz="4" w:color="D9D9D9"/>
+              <w:bottom w:val="single" w:sz="4" w:color="D9D9D9"/>
+              <w:right w:val="single" w:sz="4" w:color="D9D9D9"/>
+            </w:tcBorders>
+            <w:tcMar>
+              <w:top w:w="95" w:type="dxa"/>
+              <w:left w:w="95" w:type="dxa"/>
+              <w:bottom w:w="95" w:type="dxa"/>
+              <w:right w:w="95" w:type="dxa"/>
+            </w:tcMar>
+          </w:tcPr>
+          <w:p>
+            <w:pPr>
+              <w:spacing w:after="40" w:line="247" w:lineRule="auto"/>
+            </w:pPr>
+            <w:r>
+              <w:rPr>
+                <w:sz w:val="19"/>
+              </w:rPr>
+              <w:t>Proposed</w:t>
+            </w:r>
+          </w:p>
+        </w:tc>
+        <w:tc>
+          <w:tcPr>
+            <w:tcW w:type="dxa" w:w="4248"/>
+            <w:vAlign w:val="center"/>
+            <w:shd w:fill="FFFFFF"/>
+            <w:tcBorders>
+              <w:top w:val="single" w:sz="4" w:color="D9D9D9"/>
+              <w:left w:val="single" w:sz="4" w:color="D9D9D9"/>
+              <w:bottom w:val="single" w:sz="4" w:color="D9D9D9"/>
+              <w:right w:val="single" w:sz="4" w:color="D9D9D9"/>
+            </w:tcBorders>
+            <w:tcMar>
+              <w:top w:w="95" w:type="dxa"/>
+              <w:left w:w="95" w:type="dxa"/>
+              <w:bottom w:w="95" w:type="dxa"/>
+              <w:right w:w="95" w:type="dxa"/>
+            </w:tcMar>
+          </w:tcPr>
+          <w:p>
+            <w:pPr>
+              <w:spacing w:after="40" w:line="247" w:lineRule="auto"/>
+            </w:pPr>
+            <w:r>
+              <w:rPr>
+                <w:sz w:val="19"/>
+              </w:rPr>
+              <w:t>Firewood bundle and placement as the first ordinary task</w:t>
+            </w:r>
+          </w:p>
+        </w:tc>
+        <w:tc>
+          <w:tcPr>
+            <w:tcW w:type="dxa" w:w="3816"/>
+            <w:vAlign w:val="center"/>
+            <w:shd w:fill="FFFFFF"/>
+            <w:tcBorders>
+              <w:top w:val="single" w:sz="4" w:color="D9D9D9"/>
+              <w:left w:val="single" w:sz="4" w:color="D9D9D9"/>
+              <w:bottom w:val="single" w:sz="4" w:color="D9D9D9"/>
+              <w:right w:val="single" w:sz="4" w:color="D9D9D9"/>
+            </w:tcBorders>
+            <w:tcMar>
+              <w:top w:w="95" w:type="dxa"/>
+              <w:left w:w="95" w:type="dxa"/>
+              <w:bottom w:w="95" w:type="dxa"/>
+              <w:right w:w="95" w:type="dxa"/>
+            </w:tcMar>
+          </w:tcPr>
+          <w:p>
+            <w:pPr>
+              <w:spacing w:after="40" w:line="247" w:lineRule="auto"/>
+            </w:pPr>
+            <w:r>
+              <w:rPr>
+                <w:sz w:val="19"/>
+              </w:rPr>
+              <w:t>Test route, readability and return motivation; defer cooking</w:t>
+            </w:r>
+          </w:p>
+        </w:tc>
+      </w:tr>
+      <w:tr>
+        <w:trPr>
+          <w:cantSplit/>
+        </w:trPr>
+        <w:tc>
+          <w:tcPr>
+            <w:tcW w:type="dxa" w:w="648"/>
+            <w:vAlign w:val="center"/>
+            <w:shd w:fill="FFFFFF"/>
+            <w:tcBorders>
+              <w:top w:val="single" w:sz="4" w:color="D9D9D9"/>
+              <w:left w:val="single" w:sz="4" w:color="D9D9D9"/>
+              <w:bottom w:val="single" w:sz="4" w:color="D9D9D9"/>
+              <w:right w:val="single" w:sz="4" w:color="D9D9D9"/>
+            </w:tcBorders>
+            <w:tcMar>
+              <w:top w:w="95" w:type="dxa"/>
+              <w:left w:w="95" w:type="dxa"/>
+              <w:bottom w:w="95" w:type="dxa"/>
+              <w:right w:w="95" w:type="dxa"/>
+            </w:tcMar>
+          </w:tcPr>
+          <w:p>
+            <w:pPr>
+              <w:spacing w:after="40" w:line="247" w:lineRule="auto"/>
+            </w:pPr>
+            <w:r>
+              <w:rPr>
+                <w:sz w:val="19"/>
+              </w:rPr>
+              <w:t>D15</w:t>
+            </w:r>
+          </w:p>
+        </w:tc>
+        <w:tc>
+          <w:tcPr>
+            <w:tcW w:type="dxa" w:w="1224"/>
+            <w:vAlign w:val="center"/>
+            <w:shd w:fill="FFFFFF"/>
+            <w:tcBorders>
+              <w:top w:val="single" w:sz="4" w:color="D9D9D9"/>
+              <w:left w:val="single" w:sz="4" w:color="D9D9D9"/>
+              <w:bottom w:val="single" w:sz="4" w:color="D9D9D9"/>
+              <w:right w:val="single" w:sz="4" w:color="D9D9D9"/>
+            </w:tcBorders>
+            <w:tcMar>
+              <w:top w:w="95" w:type="dxa"/>
+              <w:left w:w="95" w:type="dxa"/>
+              <w:bottom w:w="95" w:type="dxa"/>
+              <w:right w:w="95" w:type="dxa"/>
+            </w:tcMar>
+          </w:tcPr>
+          <w:p>
+            <w:pPr>
+              <w:spacing w:after="40" w:line="247" w:lineRule="auto"/>
+            </w:pPr>
+            <w:r>
+              <w:rPr>
+                <w:sz w:val="19"/>
+              </w:rPr>
+              <w:t>Proposed</w:t>
+            </w:r>
+          </w:p>
+        </w:tc>
+        <w:tc>
+          <w:tcPr>
+            <w:tcW w:type="dxa" w:w="4248"/>
+            <w:vAlign w:val="center"/>
+            <w:shd w:fill="FFFFFF"/>
+            <w:tcBorders>
+              <w:top w:val="single" w:sz="4" w:color="D9D9D9"/>
+              <w:left w:val="single" w:sz="4" w:color="D9D9D9"/>
+              <w:bottom w:val="single" w:sz="4" w:color="D9D9D9"/>
+              <w:right w:val="single" w:sz="4" w:color="D9D9D9"/>
+            </w:tcBorders>
+            <w:tcMar>
+              <w:top w:w="95" w:type="dxa"/>
+              <w:left w:w="95" w:type="dxa"/>
+              <w:bottom w:w="95" w:type="dxa"/>
+              <w:right w:w="95" w:type="dxa"/>
+            </w:tcMar>
+          </w:tcPr>
+          <w:p>
+            <w:pPr>
+              <w:spacing w:after="40" w:line="247" w:lineRule="auto"/>
+            </w:pPr>
+            <w:r>
+              <w:rPr>
+                <w:sz w:val="19"/>
+              </w:rPr>
+              <w:t>Figure, whispers, laughter and two-light vehicle illusion</w:t>
+            </w:r>
+          </w:p>
+        </w:tc>
+        <w:tc>
+          <w:tcPr>
+            <w:tcW w:type="dxa" w:w="3816"/>
+            <w:vAlign w:val="center"/>
+            <w:shd w:fill="FFFFFF"/>
+            <w:tcBorders>
+              <w:top w:val="single" w:sz="4" w:color="D9D9D9"/>
+              <w:left w:val="single" w:sz="4" w:color="D9D9D9"/>
+              <w:bottom w:val="single" w:sz="4" w:color="D9D9D9"/>
+              <w:right w:val="single" w:sz="4" w:color="D9D9D9"/>
+            </w:tcBorders>
+            <w:tcMar>
+              <w:top w:w="95" w:type="dxa"/>
+              <w:left w:w="95" w:type="dxa"/>
+              <w:bottom w:w="95" w:type="dxa"/>
+              <w:right w:w="95" w:type="dxa"/>
+            </w:tcMar>
+          </w:tcPr>
+          <w:p>
+            <w:pPr>
+              <w:spacing w:after="40" w:line="247" w:lineRule="auto"/>
+            </w:pPr>
+            <w:r>
+              <w:rPr>
+                <w:sz w:val="19"/>
+              </w:rPr>
+              <w:t>Evaluate cues separately; no full vehicle or general enemy AI</w:t>
+            </w:r>
+          </w:p>
+        </w:tc>
+      </w:tr>
     </w:tbl>
     <w:p>
       <w:pPr>
@@ -9795,7 +10251,7 @@
         <w:pStyle w:val="Heading2"/>
       </w:pPr>
       <w:r>
-        <w:t>First implementation session</w:t>
+        <w:t>Next implementation slice</w:t>
       </w:r>
     </w:p>
     <w:p>
@@ -9803,7 +10259,7 @@
         <w:ind w:left="173" w:hanging="173"/>
       </w:pPr>
       <w:r>
-        <w:t>•  Verify the existing project opens and compiles; record actual versions and create a recoverable baseline.</w:t>
+        <w:t>•  Preserve the playable van baseline and verify interaction, door state, camera transitions and reset behavior.</w:t>
       </w:r>
     </w:p>
     <w:p>
@@ -9811,7 +10267,7 @@
         <w:ind w:left="173" w:hanging="173"/>
       </w:pPr>
       <w:r>
-        <w:t>•  Graybox the camper, door threshold, short route and one outdoor destination using Quinn.</w:t>
+        <w:t>•  Add one firewood bundle and one placement interaction as the proposed outdoor task; defer inventory and cooking systems.</w:t>
       </w:r>
     </w:p>
     <w:p>
@@ -9819,7 +10275,7 @@
         <w:ind w:left="173" w:hanging="173"/>
       </w:pPr>
       <w:r>
-        <w:t>•  Implement perspective transition and manual lock feedback, then test from both sides of the door.</w:t>
+        <w:t>•  Author one quiet outdoor cue, a reason to retreat, and an inside nighttime boundary test. Decide the unlocked consequence before implementing it.</w:t>
       </w:r>
     </w:p>
     <w:p>
@@ -9827,12 +10283,12 @@
         <w:ind w:left="173" w:hanging="173"/>
       </w:pPr>
       <w:r>
-        <w:t>•  Create an event stub that plays one localized knock only after the player returns. Expand to the full night after movement and state are reliable.</w:t>
+        <w:t>•  Test the complete locked and unlocked responses and repeatable reset before adding a figure, headlights or more ambient variation.</w:t>
       </w:r>
     </w:p>
     <w:p>
       <w:r>
-        <w:t>Change record — Version 0.2 corrects the prototype character to Quinn, the female model, following developer clarification. Version 0.1 established the supplied design baseline and explicitly labeled prototype proposals. No release date, commercial scope or unresolved narrative choice is approved by this document.</w:t>
+        <w:t>Change record — Version 0.3 adds campsite routines, retreat, night disturbances and proposed encounter authoring. It replaces the water-first sequence, records candidate figure and headlight cues, and leaves the unlocked consequence open. Version 0.2 confirmed Quinn; version 0.1 established the baseline.</w:t>
       </w:r>
     </w:p>
     <w:sectPr>

</xml_diff>

<commit_message>
moved the fire wood around the map
</commit_message>
<xml_diff>
--- a/Design/Roam_Alone_Game_Design_Document.docx
+++ b/Design/Roam_Alone_Game_Design_Document.docx
@@ -20,7 +20,7 @@
     </w:p>
     <w:p>
       <w:r>
-        <w:t>Working title  •  Version 0.3  •  27 October 2026</w:t>
+        <w:t>Working title  •  Version 0.4  •  27 October 2026</w:t>
       </w:r>
     </w:p>
     <w:p>
@@ -2044,7 +2044,7 @@
     </w:p>
     <w:p>
       <w:r>
-        <w:t>CONFIRMED direction — Ordinary outdoor activities establish routine before the night encounter. PROPOSED first task — Collect one firewood bundle and place it at the fire. Fire preparation and cooking are candidate later interactions. A water or bathroom outing can be considered later; it is no longer the required trigger for the first prototype. Avoid survival meters, broad inventories and crafting systems.</w:t>
+        <w:t>CONFIRMED — Gather three individual logs at fixed locations around the campsite, then deliver all three to the fire pit once. Collection keeps the player outside and gives later authored cues a place in the route. Fire preparation and cooking remain later candidates. Avoid survival meters, broad inventories and crafting systems.</w:t>
       </w:r>
     </w:p>
     <w:p>
@@ -2900,7 +2900,7 @@
               <w:rPr>
                 <w:sz w:val="19"/>
               </w:rPr>
-              <w:t>Proposed: collect a firewood bundle and place it at the fire</w:t>
+              <w:t>Gather three scattered logs, then place all three at the fire pit in one delivery</w:t>
             </w:r>
           </w:p>
         </w:tc>
@@ -3663,7 +3663,7 @@
     <w:p>
       <w:pPr/>
       <w:r>
-        <w:t>PROPOSED first slice — Interact with one firewood bundle, carry or represent that bundle simply, and place it at the fire. A task flag is sufficient. Keep the route short and legible; introduce no hunger, fuel economy, crafting tree or large inventory. Fire lighting and cooking can follow after this loop works.</w:t>
+        <w:t>CONFIRMED first task — Gather three individual logs along a short campsite route. Show Collect firewood: 0/3 and update after each unique pickup. Carry all three and place them together at the fire pit. Refuse early placement without losing progress. Reset restores every log and the empty pit. No inventory screen or new carry animation is required.</w:t>
       </w:r>
     </w:p>
     <w:p>
@@ -3784,7 +3784,7 @@
     </w:p>
     <w:p>
       <w:r>
-        <w:t>PROPOSED layout — Place the van and fire in a clearing, one nearby firewood pickup, a recognizable return landmark, distant figure staging and a hidden road approach for headlights. Keep one readable outdoor route. Reserve water or bathroom locations for a later task only if the first encounter earns the added scope.</w:t>
+        <w:t>PROPOSED layout — Place the van and fire in a clearing, three spaced firewood pickups, a recognizable return landmark, distant figure staging and a hidden road approach for headlights. Keep one readable outdoor route. Reserve water or bathroom locations for a later task only if the first encounter earns the added scope.</w:t>
       </w:r>
     </w:p>
     <w:p>
@@ -10050,7 +10050,7 @@
               <w:rPr>
                 <w:sz w:val="19"/>
               </w:rPr>
-              <w:t>Proposed</w:t>
+              <w:t>Confirmed</w:t>
             </w:r>
           </w:p>
         </w:tc>
@@ -10080,7 +10080,7 @@
               <w:rPr>
                 <w:sz w:val="19"/>
               </w:rPr>
-              <w:t>Firewood bundle and placement as the first ordinary task</w:t>
+              <w:t>Gather three scattered logs before one fire-pit delivery</w:t>
             </w:r>
           </w:p>
         </w:tc>
@@ -10110,7 +10110,7 @@
               <w:rPr>
                 <w:sz w:val="19"/>
               </w:rPr>
-              <w:t>Test route, readability and return motivation; defer cooking</w:t>
+              <w:t>Test exposure, pickup feedback, early returns and repeatable reset</w:t>
             </w:r>
           </w:p>
         </w:tc>
@@ -10267,7 +10267,7 @@
         <w:ind w:left="173" w:hanging="173"/>
       </w:pPr>
       <w:r>
-        <w:t>•  Add one firewood bundle and one placement interaction as the proposed outdoor task; defer inventory and cooking systems.</w:t>
+        <w:t>•  Playtest the three-log route and single fire-pit delivery. Check that pickup progress, early-return feedback and reset are clear; defer inventory and cooking systems.</w:t>
       </w:r>
     </w:p>
     <w:p>
@@ -10288,7 +10288,7 @@
     </w:p>
     <w:p>
       <w:r>
-        <w:t>Change record — Version 0.3 adds campsite routines, retreat, night disturbances and proposed encounter authoring. It replaces the water-first sequence, records candidate figure and headlight cues, and leaves the unlocked consequence open. Version 0.2 confirmed Quinn; version 0.1 established the baseline.</w:t>
+        <w:t>Change record — Version 0.4 replaces one bundle with three scattered logs and one delivery. Version 0.3 established campsite routines and proposed encounter authoring, keeping the unlocked consequence open. Version 0.2 confirmed Quinn; version 0.1 established the baseline.</w:t>
       </w:r>
     </w:p>
     <w:sectPr>

</xml_diff>

<commit_message>
Add first campsite encounter with door-state reactions and horn resolution
</commit_message>
<xml_diff>
--- a/Design/Roam_Alone_Game_Design_Document.docx
+++ b/Design/Roam_Alone_Game_Design_Document.docx
@@ -20,7 +20,7 @@
     </w:p>
     <w:p>
       <w:r>
-        <w:t>Working title  •  Version 0.4  •  27 October 2026</w:t>
+        <w:t>Working title  •  Version 0.5  •  27 October 2026</w:t>
       </w:r>
     </w:p>
     <w:p>
@@ -2665,7 +2665,7 @@
     </w:p>
     <w:p>
       <w:r>
-        <w:t>OPEN — The exact unlocked-door consequence and recovery. A brief door opening with an alarming cue and an opportunity to respond is PROPOSED for evaluation. Death, capture, chase, forced intrusion and checkpoint restart are not approved by this revision. Define a readable consequence before implementing it; a locked door must not be silently bypassed.</w:t>
+        <w:t>CONFIRMED prototype resolution — An unseen visitor tests the door. A locked door holds; a closed, unlocked door opens through the existing validated operation if clear. An already-open door receives footsteps at the doorway; blocked movement preserves the door state. The player may close and lock, then use a labeled inside horn control to make their presence known. Footsteps retreat, a quiet pause fades to morning, and the player can restart. No alarm, combat or death system is required.</w:t>
       </w:r>
     </w:p>
     <w:p>
@@ -3185,7 +3185,7 @@
               <w:rPr>
                 <w:sz w:val="19"/>
               </w:rPr>
-              <w:t>One nearby disturbance; objective clearly points back to the van</w:t>
+              <w:t>A nearby branch snap after firewood delivery; objective points back to the van</w:t>
             </w:r>
           </w:p>
         </w:tc>
@@ -3470,7 +3470,7 @@
               <w:rPr>
                 <w:sz w:val="19"/>
               </w:rPr>
-              <w:t>Locked: door holds and visitor withdraws. Unlocked or open: distinct consequence remains OPEN</w:t>
+              <w:t>Locked: door holds. Closed and unlocked: validated opening if clear. Open: footsteps at doorway. Player responds with the inside horn.</w:t>
             </w:r>
           </w:p>
         </w:tc>
@@ -3565,7 +3565,7 @@
               <w:rPr>
                 <w:sz w:val="19"/>
               </w:rPr>
-              <w:t>Proposed quiet withdrawal or morning beat; reset every phase and cue</w:t>
+              <w:t>Horn makes the visitor retreat; footsteps fade, then fade to morning and offer a clean restart</w:t>
             </w:r>
           </w:p>
         </w:tc>
@@ -5925,7 +5925,7 @@
     <w:p>
       <w:pPr/>
       <w:r>
-        <w:t>Acceptance: complete the task and retreat; observe distinct locked and unlocked responses; freely unlock from inside; finish and reset twice without duplicate cues or stale timers. Check early return, waiting, an open door, a blocked opening and pausing. OPEN: the exact unlocked consequence, response opportunity and final resolution. Decide these before implementing dependent effects.</w:t>
+        <w:t>Acceptance: deliver the wood, retreat, prepare, observe the handle attempt and sound the horn from inside. Test locked, unlocked, already-open and obstructed doors; unlocking remains available. Hear retreating footsteps, reach morning and restart twice. Critical beats wait if the player leaves the van before the attempt; no door state is forced to satisfy the sequence.</w:t>
       </w:r>
     </w:p>
     <w:p>
@@ -9300,7 +9300,7 @@
               <w:rPr>
                 <w:sz w:val="19"/>
               </w:rPr>
-              <w:t>Open</w:t>
+              <w:t>Confirmed</w:t>
             </w:r>
           </w:p>
         </w:tc>
@@ -9330,7 +9330,7 @@
               <w:rPr>
                 <w:sz w:val="19"/>
               </w:rPr>
-              <w:t>Unlocked-door consequence, failure and recovery</w:t>
+              <w:t>Validated unlocked opening; inside horn drives withdrawal and morning</w:t>
             </w:r>
           </w:p>
         </w:tc>
@@ -9360,7 +9360,7 @@
               <w:rPr>
                 <w:sz w:val="19"/>
               </w:rPr>
-              <w:t>Decide before implementing; brief opening cue is a proposal</w:t>
+              <w:t>Test locked, unlocked, open and blocked routes; clean restart</w:t>
             </w:r>
           </w:p>
         </w:tc>
@@ -9925,7 +9925,7 @@
               <w:rPr>
                 <w:sz w:val="19"/>
               </w:rPr>
-              <w:t>Proposed</w:t>
+              <w:t>Confirmed</w:t>
             </w:r>
           </w:p>
         </w:tc>
@@ -9978,14 +9978,8 @@
             </w:tcMar>
           </w:tcPr>
           <w:p>
-            <w:pPr>
-              <w:spacing w:after="40" w:line="247" w:lineRule="auto"/>
-            </w:pPr>
             <w:r>
-              <w:rPr>
-                <w:sz w:val="19"/>
-              </w:rPr>
-              <w:t>Prove first sequence; add data assets when reuse earns them</w:t>
+              <w:t>Test one director with explicit references and tunable cues.</w:t>
             </w:r>
           </w:p>
         </w:tc>
@@ -10275,7 +10269,7 @@
         <w:ind w:left="173" w:hanging="173"/>
       </w:pPr>
       <w:r>
-        <w:t>•  Author one quiet outdoor cue, a reason to retreat, and an inside nighttime boundary test. Decide the unlocked consequence before implementing it.</w:t>
+        <w:t>•  Test delivery, retreat, door attempt, inside horn response and morning in the current greybox.</w:t>
       </w:r>
     </w:p>
     <w:p>
@@ -10288,7 +10282,7 @@
     </w:p>
     <w:p>
       <w:r>
-        <w:t>Change record — Version 0.4 replaces one bundle with three scattered logs and one delivery. Version 0.3 established campsite routines and proposed encounter authoring, keeping the unlocked consequence open. Version 0.2 confirmed Quinn; version 0.1 established the baseline.</w:t>
+        <w:t>Change record — Version 0.5 confirms the horn response, unlocked opening and morning resolution. Version 0.4 added scattered logs; 0.3 established campsite routines; 0.2 confirmed Quinn; 0.1 set the baseline.</w:t>
       </w:r>
     </w:p>
     <w:sectPr>

</xml_diff>